<commit_message>
Complete round trip preservation for paragraphs tables images headers and footers
</commit_message>
<xml_diff>
--- a/samples/tables_images_only.docx
+++ b/samples/tables_images_only.docx
@@ -2,6 +2,36 @@
 <file path=word/document.xml><?xml version="1.0" encoding="utf-8"?>
 <w:document xmlns:wpc="http://schemas.microsoft.com/office/word/2010/wordprocessingCanvas" xmlns:cx="http://schemas.microsoft.com/office/drawing/2014/chartex" xmlns:cx1="http://schemas.microsoft.com/office/drawing/2015/9/8/chartex" xmlns:cx2="http://schemas.microsoft.com/office/drawing/2015/10/21/chartex" xmlns:cx3="http://schemas.microsoft.com/office/drawing/2016/5/9/chartex" xmlns:cx4="http://schemas.microsoft.com/office/drawing/2016/5/10/chartex" xmlns:cx5="http://schemas.microsoft.com/office/drawing/2016/5/11/chartex" xmlns:cx6="http://schemas.microsoft.com/office/drawing/2016/5/12/chartex" xmlns:cx7="http://schemas.microsoft.com/office/drawing/2016/5/13/chartex" xmlns:cx8="http://schemas.microsoft.com/office/drawing/2016/5/14/chartex" xmlns:mc="http://schemas.openxmlformats.org/markup-compatibility/2006" xmlns:aink="http://schemas.microsoft.com/office/drawing/2016/ink" xmlns:am3d="http://schemas.microsoft.com/office/drawing/2017/model3d" xmlns:o="urn:schemas-microsoft-com:office:office" xmlns:oel="http://schemas.microsoft.com/office/2019/extlst" xmlns:r="http://schemas.openxmlformats.org/officeDocument/2006/relationships" xmlns:m="http://schemas.openxmlformats.org/officeDocument/2006/math" xmlns:v="urn:schemas-microsoft-com:vml" xmlns:wp14="http://schemas.microsoft.com/office/word/2010/wordprocessingDrawing" xmlns:wp="http://schemas.openxmlformats.org/drawingml/2006/wordprocessingDrawing" xmlns:w10="urn:schemas-microsoft-com:office:word" xmlns:w="http://schemas.openxmlformats.org/wordprocessingml/2006/main" xmlns:w14="http://schemas.microsoft.com/office/word/2010/wordml" xmlns:w15="http://schemas.microsoft.com/office/word/2012/wordml" xmlns:w16cex="http://schemas.microsoft.com/office/word/2018/wordml/cex" xmlns:w16cid="http://schemas.microsoft.com/office/word/2016/wordml/cid" xmlns:w16="http://schemas.microsoft.com/office/word/2018/wordml" xmlns:w16du="http://schemas.microsoft.com/office/word/2023/wordml/word16du" xmlns:w16sdtdh="http://schemas.microsoft.com/office/word/2020/wordml/sdtdatahash" xmlns:w16sdtfl="http://schemas.microsoft.com/office/word/2024/wordml/sdtformatlock" xmlns:w16se="http://schemas.microsoft.com/office/word/2015/wordml/symex" xmlns:wpg="http://schemas.microsoft.com/office/word/2010/wordprocessingGroup" xmlns:wpi="http://schemas.microsoft.com/office/word/2010/wordprocessingInk" xmlns:wne="http://schemas.microsoft.com/office/word/2006/wordml" xmlns:wps="http://schemas.microsoft.com/office/word/2010/wordprocessingShape" mc:Ignorable="w14 w15 w16se w16cid w16 w16cex w16sdtdh w16sdtfl w16du wp14">
   <w:body>
+    <w:p>
+      <w:pPr>
+        <w:pStyle w:val="Caption"/>
+        <w:keepNext/>
+      </w:pPr>
+      <w:r>
+        <w:t xml:space="preserve">Table </w:t>
+      </w:r>
+      <w:r>
+        <w:fldChar w:fldCharType="begin"/>
+      </w:r>
+      <w:r>
+        <w:instrText xml:space="preserve"> SEQ Table \* ARABIC </w:instrText>
+      </w:r>
+      <w:r>
+        <w:fldChar w:fldCharType="separate"/>
+      </w:r>
+      <w:r>
+        <w:rPr>
+          <w:noProof/>
+        </w:rPr>
+        <w:t>1</w:t>
+      </w:r>
+      <w:r>
+        <w:fldChar w:fldCharType="end"/>
+      </w:r>
+      <w:r>
+        <w:t>this is table 1</w:t>
+      </w:r>
+    </w:p>
     <w:tbl>
       <w:tblPr>
         <w:tblW w:w="0" w:type="auto"/>
@@ -481,21 +511,7 @@
                 <w:lang w:val="en-US"/>
               </w:rPr>
               <w:br/>
-              <w:t xml:space="preserve">Synchronous </w:t>
-            </w:r>
-            <w:proofErr w:type="gramStart"/>
-            <w:r>
-              <w:rPr>
-                <w:lang w:val="en-US"/>
-              </w:rPr>
-              <w:t>Serial  Interface</w:t>
-            </w:r>
-            <w:proofErr w:type="gramEnd"/>
-            <w:r>
-              <w:rPr>
-                <w:lang w:val="en-US"/>
-              </w:rPr>
-              <w:t>; Schmitt-Trigger input</w:t>
+              <w:t>Synchronous Serial  Interface; Schmitt-Trigger input</w:t>
             </w:r>
           </w:p>
         </w:tc>
@@ -538,14 +554,12 @@
                 <w:lang w:val="en-US"/>
               </w:rPr>
             </w:pPr>
-            <w:proofErr w:type="spellStart"/>
             <w:r>
               <w:rPr>
                 <w:lang w:val="en-US"/>
               </w:rPr>
               <w:t>CSn</w:t>
             </w:r>
-            <w:proofErr w:type="spellEnd"/>
           </w:p>
         </w:tc>
         <w:tc>
@@ -1035,23 +1049,7 @@
                 <w:spacing w:val="0"/>
                 <w:szCs w:val="16"/>
               </w:rPr>
-              <w:t xml:space="preserve">3V-Regulator Output, internally regulated from VDD5V. Connect to VDD5V for 3V supply voltage. Do not </w:t>
-            </w:r>
-            <w:proofErr w:type="gramStart"/>
-            <w:r>
-              <w:rPr>
-                <w:spacing w:val="0"/>
-                <w:szCs w:val="16"/>
-              </w:rPr>
-              <w:t>load</w:t>
-            </w:r>
-            <w:proofErr w:type="gramEnd"/>
-            <w:r>
-              <w:rPr>
-                <w:spacing w:val="0"/>
-                <w:szCs w:val="16"/>
-              </w:rPr>
-              <w:t xml:space="preserve"> externally.</w:t>
+              <w:t>3V-Regulator Output, internally regulated from VDD5V. Connect to VDD5V for 3V supply voltage. Do not load externally.</w:t>
             </w:r>
           </w:p>
         </w:tc>
@@ -1140,21 +1138,7 @@
               <w:rPr>
                 <w:lang w:val="en-US"/>
               </w:rPr>
-              <w:t xml:space="preserve">Positive Supply Voltage, 3.0 </w:t>
-            </w:r>
-            <w:proofErr w:type="gramStart"/>
-            <w:r>
-              <w:rPr>
-                <w:lang w:val="en-US"/>
-              </w:rPr>
-              <w:t>to  5.5</w:t>
-            </w:r>
-            <w:proofErr w:type="gramEnd"/>
-            <w:r>
-              <w:rPr>
-                <w:lang w:val="en-US"/>
-              </w:rPr>
-              <w:t xml:space="preserve"> V</w:t>
+              <w:t>Positive Supply Voltage, 3.0 to  5.5 V</w:t>
             </w:r>
           </w:p>
         </w:tc>
@@ -1568,14 +1552,12 @@
                 <w:lang w:val="en-US"/>
               </w:rPr>
             </w:pPr>
-            <w:proofErr w:type="spellStart"/>
             <w:r>
               <w:rPr>
                 <w:lang w:val="en-US"/>
               </w:rPr>
               <w:t>MagINCn</w:t>
             </w:r>
-            <w:proofErr w:type="spellEnd"/>
           </w:p>
         </w:tc>
         <w:tc>
@@ -1638,7 +1620,6 @@
               </w:rPr>
               <w:t xml:space="preserve">nitude </w:t>
             </w:r>
-            <w:proofErr w:type="spellStart"/>
             <w:r>
               <w:rPr>
                 <w:b/>
@@ -1650,14 +1631,7 @@
               <w:rPr>
                 <w:lang w:val="en-US"/>
               </w:rPr>
-              <w:t>rease</w:t>
-            </w:r>
-            <w:proofErr w:type="spellEnd"/>
-            <w:r>
-              <w:rPr>
-                <w:lang w:val="en-US"/>
-              </w:rPr>
-              <w:t xml:space="preserve">; active low, indicates a distance reduction between the magnet and the device surface. See </w:t>
+              <w:t xml:space="preserve">rease; active low, indicates a distance reduction between the magnet and the device surface. See </w:t>
             </w:r>
             <w:r>
               <w:rPr>
@@ -1738,14 +1712,12 @@
                 <w:lang w:val="en-US"/>
               </w:rPr>
             </w:pPr>
-            <w:proofErr w:type="spellStart"/>
             <w:r>
               <w:rPr>
                 <w:lang w:val="en-US"/>
               </w:rPr>
               <w:t>MagDECn</w:t>
             </w:r>
-            <w:proofErr w:type="spellEnd"/>
           </w:p>
         </w:tc>
         <w:tc>
@@ -1800,7 +1772,6 @@
               </w:rPr>
               <w:t xml:space="preserve">nitude </w:t>
             </w:r>
-            <w:proofErr w:type="spellStart"/>
             <w:r>
               <w:rPr>
                 <w:b/>
@@ -1812,14 +1783,7 @@
               <w:rPr>
                 <w:lang w:val="en-US"/>
               </w:rPr>
-              <w:t>rease</w:t>
-            </w:r>
-            <w:proofErr w:type="spellEnd"/>
-            <w:r>
-              <w:rPr>
-                <w:lang w:val="en-US"/>
-              </w:rPr>
-              <w:t xml:space="preserve">; active low, indicates a distance increase between the device and the magnet. See </w:t>
+              <w:t xml:space="preserve">rease; active low, indicates a distance increase between the device and the magnet. See </w:t>
             </w:r>
             <w:r>
               <w:rPr>
@@ -2169,14 +2133,12 @@
                 <w:lang w:val="en-US"/>
               </w:rPr>
             </w:pPr>
-            <w:proofErr w:type="spellStart"/>
             <w:r>
               <w:rPr>
                 <w:lang w:val="en-US"/>
               </w:rPr>
               <w:t>Mode_Index</w:t>
             </w:r>
-            <w:proofErr w:type="spellEnd"/>
           </w:p>
         </w:tc>
         <w:tc>
@@ -2220,6 +2182,36 @@
       </w:tr>
     </w:tbl>
     <w:p/>
+    <w:p>
+      <w:pPr>
+        <w:pStyle w:val="Caption"/>
+        <w:keepNext/>
+      </w:pPr>
+      <w:r>
+        <w:t xml:space="preserve">Table </w:t>
+      </w:r>
+      <w:r>
+        <w:fldChar w:fldCharType="begin"/>
+      </w:r>
+      <w:r>
+        <w:instrText xml:space="preserve"> SEQ Table \* ARABIC </w:instrText>
+      </w:r>
+      <w:r>
+        <w:fldChar w:fldCharType="separate"/>
+      </w:r>
+      <w:r>
+        <w:rPr>
+          <w:noProof/>
+        </w:rPr>
+        <w:t>2</w:t>
+      </w:r>
+      <w:r>
+        <w:fldChar w:fldCharType="end"/>
+      </w:r>
+      <w:r>
+        <w:t xml:space="preserve"> this is table 2</w:t>
+      </w:r>
+    </w:p>
     <w:tbl>
       <w:tblPr>
         <w:tblW w:w="0" w:type="auto"/>
@@ -2413,14 +2405,12 @@
                 <w:lang w:val="en-US"/>
               </w:rPr>
             </w:pPr>
-            <w:proofErr w:type="spellStart"/>
             <w:r>
               <w:rPr>
                 <w:lang w:val="en-US"/>
               </w:rPr>
               <w:t>MagINCn</w:t>
             </w:r>
-            <w:proofErr w:type="spellEnd"/>
           </w:p>
         </w:tc>
         <w:tc>
@@ -2483,7 +2473,6 @@
               </w:rPr>
               <w:t xml:space="preserve">nitude </w:t>
             </w:r>
-            <w:proofErr w:type="spellStart"/>
             <w:r>
               <w:rPr>
                 <w:b/>
@@ -2495,14 +2484,7 @@
               <w:rPr>
                 <w:lang w:val="en-US"/>
               </w:rPr>
-              <w:t>rease</w:t>
-            </w:r>
-            <w:proofErr w:type="spellEnd"/>
-            <w:r>
-              <w:rPr>
-                <w:lang w:val="en-US"/>
-              </w:rPr>
-              <w:t xml:space="preserve">; active low, indicates a distance reduction between the magnet and the device surface. See </w:t>
+              <w:t xml:space="preserve">rease; active low, indicates a distance reduction between the magnet and the device surface. See </w:t>
             </w:r>
             <w:r>
               <w:rPr>
@@ -2583,14 +2565,12 @@
                 <w:lang w:val="en-US"/>
               </w:rPr>
             </w:pPr>
-            <w:proofErr w:type="spellStart"/>
             <w:r>
               <w:rPr>
                 <w:lang w:val="en-US"/>
               </w:rPr>
               <w:t>MagDECn</w:t>
             </w:r>
-            <w:proofErr w:type="spellEnd"/>
           </w:p>
         </w:tc>
         <w:tc>
@@ -2645,7 +2625,6 @@
               </w:rPr>
               <w:t xml:space="preserve">nitude </w:t>
             </w:r>
-            <w:proofErr w:type="spellStart"/>
             <w:r>
               <w:rPr>
                 <w:b/>
@@ -2657,14 +2636,7 @@
               <w:rPr>
                 <w:lang w:val="en-US"/>
               </w:rPr>
-              <w:t>rease</w:t>
-            </w:r>
-            <w:proofErr w:type="spellEnd"/>
-            <w:r>
-              <w:rPr>
-                <w:lang w:val="en-US"/>
-              </w:rPr>
-              <w:t xml:space="preserve">; active low, indicates a distance increase between the device and the magnet. See </w:t>
+              <w:t xml:space="preserve">rease; active low, indicates a distance increase between the device and the magnet. See </w:t>
             </w:r>
             <w:r>
               <w:rPr>
@@ -3010,14 +2982,12 @@
                 <w:lang w:val="en-US"/>
               </w:rPr>
             </w:pPr>
-            <w:proofErr w:type="spellStart"/>
             <w:r>
               <w:rPr>
                 <w:lang w:val="en-US"/>
               </w:rPr>
               <w:t>Mode_Index</w:t>
             </w:r>
-            <w:proofErr w:type="spellEnd"/>
           </w:p>
         </w:tc>
         <w:tc>
@@ -3062,11 +3032,13 @@
     </w:tbl>
     <w:p/>
     <w:p>
+      <w:pPr>
+        <w:keepNext/>
+      </w:pPr>
       <w:r>
         <w:rPr>
           <w:noProof/>
         </w:rPr>
-        <w:lastRenderedPageBreak/>
         <w:drawing>
           <wp:inline distT="0" distB="0" distL="0" distR="0" wp14:anchorId="32D04875" wp14:editId="2817440A">
             <wp:extent cx="5731510" cy="4643120"/>
@@ -3117,7 +3089,67 @@
         </w:drawing>
       </w:r>
     </w:p>
+    <w:p>
+      <w:pPr>
+        <w:pStyle w:val="Caption"/>
+        <w:jc w:val="left"/>
+      </w:pPr>
+      <w:r>
+        <w:t xml:space="preserve">Figure </w:t>
+      </w:r>
+      <w:r>
+        <w:fldChar w:fldCharType="begin"/>
+      </w:r>
+      <w:r>
+        <w:instrText xml:space="preserve"> SEQ Figure \* ARABIC </w:instrText>
+      </w:r>
+      <w:r>
+        <w:fldChar w:fldCharType="separate"/>
+      </w:r>
+      <w:r>
+        <w:rPr>
+          <w:noProof/>
+        </w:rPr>
+        <w:t>1</w:t>
+      </w:r>
+      <w:r>
+        <w:fldChar w:fldCharType="end"/>
+      </w:r>
+      <w:r>
+        <w:t xml:space="preserve"> this is figure 1</w:t>
+      </w:r>
+    </w:p>
     <w:p/>
+    <w:p>
+      <w:pPr>
+        <w:pStyle w:val="Caption"/>
+        <w:keepNext/>
+      </w:pPr>
+      <w:r>
+        <w:t xml:space="preserve">Table </w:t>
+      </w:r>
+      <w:r>
+        <w:fldChar w:fldCharType="begin"/>
+      </w:r>
+      <w:r>
+        <w:instrText xml:space="preserve"> SEQ Table \* ARABIC </w:instrText>
+      </w:r>
+      <w:r>
+        <w:fldChar w:fldCharType="separate"/>
+      </w:r>
+      <w:r>
+        <w:rPr>
+          <w:noProof/>
+        </w:rPr>
+        <w:t>3</w:t>
+      </w:r>
+      <w:r>
+        <w:fldChar w:fldCharType="end"/>
+      </w:r>
+      <w:r>
+        <w:t xml:space="preserve"> this is table 3</w:t>
+      </w:r>
+    </w:p>
     <w:tbl>
       <w:tblPr>
         <w:tblW w:w="8930" w:type="dxa"/>
@@ -3357,54 +3389,22 @@
           </w:tcPr>
           <w:p>
             <w:r>
-              <w:t xml:space="preserve">max. </w:t>
-            </w:r>
-            <w:proofErr w:type="gramStart"/>
-            <w:r>
-              <w:t>speed @</w:t>
-            </w:r>
-            <w:proofErr w:type="gramEnd"/>
-            <w:r>
-              <w:t xml:space="preserve"> 4096 samples/rev.</w:t>
-            </w:r>
-          </w:p>
-          <w:p>
-            <w:r>
-              <w:t xml:space="preserve">max. </w:t>
-            </w:r>
-            <w:proofErr w:type="gramStart"/>
-            <w:r>
-              <w:t>speed @</w:t>
-            </w:r>
-            <w:proofErr w:type="gramEnd"/>
-            <w:r>
-              <w:t xml:space="preserve"> 1024 samples/rev.</w:t>
-            </w:r>
-          </w:p>
-          <w:p>
-            <w:r>
-              <w:t xml:space="preserve">max. </w:t>
-            </w:r>
-            <w:proofErr w:type="gramStart"/>
-            <w:r>
-              <w:t>speed @</w:t>
-            </w:r>
-            <w:proofErr w:type="gramEnd"/>
-            <w:r>
-              <w:t xml:space="preserve"> 256 samples/rev.</w:t>
-            </w:r>
-          </w:p>
-          <w:p>
-            <w:r>
-              <w:t xml:space="preserve">max. </w:t>
-            </w:r>
-            <w:proofErr w:type="gramStart"/>
-            <w:r>
-              <w:t>speed @</w:t>
-            </w:r>
-            <w:proofErr w:type="gramEnd"/>
-            <w:r>
-              <w:t xml:space="preserve"> 64 samples/rev.</w:t>
+              <w:t>max. speed @ 4096 samples/rev.</w:t>
+            </w:r>
+          </w:p>
+          <w:p>
+            <w:r>
+              <w:t>max. speed @ 1024 samples/rev.</w:t>
+            </w:r>
+          </w:p>
+          <w:p>
+            <w:r>
+              <w:t>max. speed @ 256 samples/rev.</w:t>
+            </w:r>
+          </w:p>
+          <w:p>
+            <w:r>
+              <w:t>max. speed @ 64 samples/rev.</w:t>
             </w:r>
           </w:p>
         </w:tc>
@@ -3484,6 +3484,36 @@
       <w:pPr>
         <w:pStyle w:val="Caption"/>
       </w:pPr>
+    </w:p>
+    <w:p>
+      <w:pPr>
+        <w:pStyle w:val="Caption"/>
+        <w:keepNext/>
+      </w:pPr>
+      <w:r>
+        <w:t xml:space="preserve">Table </w:t>
+      </w:r>
+      <w:r>
+        <w:fldChar w:fldCharType="begin"/>
+      </w:r>
+      <w:r>
+        <w:instrText xml:space="preserve"> SEQ Table \* ARABIC </w:instrText>
+      </w:r>
+      <w:r>
+        <w:fldChar w:fldCharType="separate"/>
+      </w:r>
+      <w:r>
+        <w:rPr>
+          <w:noProof/>
+        </w:rPr>
+        <w:t>4</w:t>
+      </w:r>
+      <w:r>
+        <w:fldChar w:fldCharType="end"/>
+      </w:r>
+      <w:r>
+        <w:t xml:space="preserve"> this is table 4</w:t>
+      </w:r>
     </w:p>
     <w:tbl>
       <w:tblPr>
@@ -4056,7 +4086,6 @@
                 <w:sz w:val="18"/>
                 <w:lang w:val="en-US"/>
               </w:rPr>
-              <w:lastRenderedPageBreak/>
               <w:t>Status bits</w:t>
             </w:r>
           </w:p>
@@ -4227,16 +4256,8 @@
                 <w:lang w:val="en-US"/>
               </w:rPr>
               <w:br/>
-            </w:r>
-            <w:proofErr w:type="spellStart"/>
-            <w:r>
-              <w:rPr>
-                <w:sz w:val="18"/>
-                <w:lang w:val="en-US"/>
-              </w:rPr>
               <w:t>INCn</w:t>
             </w:r>
-            <w:proofErr w:type="spellEnd"/>
           </w:p>
         </w:tc>
         <w:tc>
@@ -4273,16 +4294,8 @@
                 <w:lang w:val="en-US"/>
               </w:rPr>
               <w:br/>
-            </w:r>
-            <w:proofErr w:type="spellStart"/>
-            <w:r>
-              <w:rPr>
-                <w:sz w:val="18"/>
-                <w:lang w:val="en-US"/>
-              </w:rPr>
               <w:t>DECn</w:t>
             </w:r>
-            <w:proofErr w:type="spellEnd"/>
           </w:p>
         </w:tc>
         <w:tc>
@@ -4441,17 +4454,8 @@
                 <w:sz w:val="18"/>
                 <w:lang w:val="en-US"/>
               </w:rPr>
-              <w:t xml:space="preserve">No distance </w:t>
-            </w:r>
-            <w:proofErr w:type="gramStart"/>
-            <w:r>
-              <w:rPr>
-                <w:sz w:val="18"/>
-                <w:lang w:val="en-US"/>
-              </w:rPr>
-              <w:t>change</w:t>
-            </w:r>
-            <w:proofErr w:type="gramEnd"/>
+              <w:t>No distance change</w:t>
+            </w:r>
             <w:r>
               <w:rPr>
                 <w:sz w:val="18"/>
@@ -4895,6 +4899,9 @@
       </w:r>
     </w:p>
     <w:p>
+      <w:pPr>
+        <w:keepNext/>
+      </w:pPr>
       <w:r>
         <w:rPr>
           <w:noProof/>
@@ -5091,6 +5098,36 @@
         </w:drawing>
       </w:r>
     </w:p>
+    <w:p>
+      <w:pPr>
+        <w:pStyle w:val="Caption"/>
+        <w:jc w:val="left"/>
+      </w:pPr>
+      <w:r>
+        <w:t xml:space="preserve">Figure </w:t>
+      </w:r>
+      <w:r>
+        <w:fldChar w:fldCharType="begin"/>
+      </w:r>
+      <w:r>
+        <w:instrText xml:space="preserve"> SEQ Figure \* ARABIC </w:instrText>
+      </w:r>
+      <w:r>
+        <w:fldChar w:fldCharType="separate"/>
+      </w:r>
+      <w:r>
+        <w:rPr>
+          <w:noProof/>
+        </w:rPr>
+        <w:t>2</w:t>
+      </w:r>
+      <w:r>
+        <w:fldChar w:fldCharType="end"/>
+      </w:r>
+      <w:r>
+        <w:t xml:space="preserve"> this si figure 2</w:t>
+      </w:r>
+    </w:p>
     <w:tbl>
       <w:tblPr>
         <w:tblW w:w="9497" w:type="dxa"/>
@@ -5356,7 +5393,6 @@
                 <w:lang w:val="en-US"/>
               </w:rPr>
             </w:pPr>
-            <w:proofErr w:type="spellStart"/>
             <w:r>
               <w:rPr>
                 <w:sz w:val="18"/>
@@ -5364,7 +5400,6 @@
               </w:rPr>
               <w:t>INCn</w:t>
             </w:r>
-            <w:proofErr w:type="spellEnd"/>
           </w:p>
         </w:tc>
         <w:tc>
@@ -5401,16 +5436,8 @@
                 <w:lang w:val="en-US"/>
               </w:rPr>
               <w:br/>
-            </w:r>
-            <w:proofErr w:type="spellStart"/>
-            <w:r>
-              <w:rPr>
-                <w:sz w:val="18"/>
-                <w:lang w:val="en-US"/>
-              </w:rPr>
               <w:t>DECn</w:t>
             </w:r>
-            <w:proofErr w:type="spellEnd"/>
           </w:p>
         </w:tc>
         <w:tc>
@@ -5595,40 +5622,15 @@
                 <w:sz w:val="18"/>
                 <w:lang w:val="en-US"/>
               </w:rPr>
-              <w:t xml:space="preserve">No distance </w:t>
-            </w:r>
-            <w:proofErr w:type="gramStart"/>
-            <w:r>
-              <w:rPr>
-                <w:sz w:val="18"/>
-                <w:lang w:val="en-US"/>
-              </w:rPr>
-              <w:t>change</w:t>
-            </w:r>
-            <w:proofErr w:type="gramEnd"/>
+              <w:t>No distance change</w:t>
+            </w:r>
             <w:r>
               <w:rPr>
                 <w:sz w:val="18"/>
                 <w:lang w:val="en-US"/>
               </w:rPr>
               <w:br/>
-              <w:t xml:space="preserve">Magnetic input field OK </w:t>
-            </w:r>
-            <w:proofErr w:type="gramStart"/>
-            <w:r>
-              <w:rPr>
-                <w:sz w:val="18"/>
-                <w:lang w:val="en-US"/>
-              </w:rPr>
-              <w:t>( GREEN</w:t>
-            </w:r>
-            <w:proofErr w:type="gramEnd"/>
-            <w:r>
-              <w:rPr>
-                <w:sz w:val="18"/>
-                <w:lang w:val="en-US"/>
-              </w:rPr>
-              <w:t xml:space="preserve"> range, ~45…75mT)</w:t>
+              <w:t>Magnetic input field OK ( GREEN range, ~45…75mT)</w:t>
             </w:r>
           </w:p>
         </w:tc>
@@ -5767,23 +5769,7 @@
                 <w:sz w:val="18"/>
                 <w:lang w:val="en-US"/>
               </w:rPr>
-              <w:t xml:space="preserve">YELLOW range: magnetic field </w:t>
-            </w:r>
-            <w:proofErr w:type="gramStart"/>
-            <w:r>
-              <w:rPr>
-                <w:sz w:val="18"/>
-                <w:lang w:val="en-US"/>
-              </w:rPr>
-              <w:t>is  ~</w:t>
-            </w:r>
-            <w:proofErr w:type="gramEnd"/>
-            <w:r>
-              <w:rPr>
-                <w:sz w:val="18"/>
-                <w:lang w:val="en-US"/>
-              </w:rPr>
-              <w:t xml:space="preserve"> 25…45mT or ~75…135mT. The AS5145 may still be operated in this range, but with slightly reduced accuracy.</w:t>
+              <w:t>YELLOW range: magnetic field is  ~ 25…45mT or ~75…135mT. The AS5145 may still be operated in this range, but with slightly reduced accuracy.</w:t>
             </w:r>
           </w:p>
         </w:tc>
@@ -5922,23 +5908,7 @@
                 <w:sz w:val="18"/>
                 <w:lang w:val="en-US"/>
               </w:rPr>
-              <w:t xml:space="preserve">RED range: magnetic field is ~&lt;25mT or &gt;~135mT. It is still possible to operate the AS5145 in the red </w:t>
-            </w:r>
-            <w:proofErr w:type="gramStart"/>
-            <w:r>
-              <w:rPr>
-                <w:sz w:val="18"/>
-                <w:lang w:val="en-US"/>
-              </w:rPr>
-              <w:t>range, but</w:t>
-            </w:r>
-            <w:proofErr w:type="gramEnd"/>
-            <w:r>
-              <w:rPr>
-                <w:sz w:val="18"/>
-                <w:lang w:val="en-US"/>
-              </w:rPr>
-              <w:t xml:space="preserve"> not recommended.</w:t>
+              <w:t>RED range: magnetic field is ~&lt;25mT or &gt;~135mT. It is still possible to operate the AS5145 in the red range, but not recommended.</w:t>
             </w:r>
           </w:p>
         </w:tc>
@@ -5964,6 +5934,7 @@
                 <w:sz w:val="18"/>
                 <w:lang w:val="en-US"/>
               </w:rPr>
+              <w:lastRenderedPageBreak/>
               <w:t>All other combinations</w:t>
             </w:r>
           </w:p>
@@ -6095,7 +6066,6 @@
               <w:rPr>
                 <w:color w:val="FFFFFF"/>
               </w:rPr>
-              <w:lastRenderedPageBreak/>
               <w:t>Mode</w:t>
             </w:r>
           </w:p>
@@ -6252,7 +6222,6 @@
             <w:r>
               <w:t xml:space="preserve"> are not used the </w:t>
             </w:r>
-            <w:proofErr w:type="spellStart"/>
             <w:r>
               <w:rPr>
                 <w:b/>
@@ -6265,7 +6234,6 @@
               </w:rPr>
               <w:t>_Index</w:t>
             </w:r>
-            <w:proofErr w:type="spellEnd"/>
             <w:r>
               <w:t xml:space="preserve"> pin is used for selection of the decimation rate (low speed/high speed).</w:t>
             </w:r>
@@ -6320,13 +6288,8 @@
             <w:pPr>
               <w:pStyle w:val="TableText"/>
             </w:pPr>
-            <w:proofErr w:type="gramStart"/>
-            <w:r>
-              <w:t>10 bit</w:t>
-            </w:r>
-            <w:proofErr w:type="gramEnd"/>
-            <w:r>
-              <w:t xml:space="preserve"> incremental mode (low DNL)</w:t>
+            <w:r>
+              <w:t>10 bit incremental mode (low DNL)</w:t>
             </w:r>
           </w:p>
         </w:tc>
@@ -6388,7 +6351,6 @@
             <w:r>
               <w:t xml:space="preserve"> signal.  In this mode the </w:t>
             </w:r>
-            <w:proofErr w:type="spellStart"/>
             <w:r>
               <w:rPr>
                 <w:b/>
@@ -6401,7 +6363,6 @@
               </w:rPr>
               <w:t>_Index</w:t>
             </w:r>
-            <w:proofErr w:type="spellEnd"/>
             <w:r>
               <w:t xml:space="preserve"> Pin is switched from input to output and will be the </w:t>
             </w:r>
@@ -6460,15 +6421,7 @@
               <w:pStyle w:val="TableText"/>
             </w:pPr>
             <w:r>
-              <w:t xml:space="preserve">12 </w:t>
-            </w:r>
-            <w:proofErr w:type="gramStart"/>
-            <w:r>
-              <w:t>bit</w:t>
-            </w:r>
-            <w:proofErr w:type="gramEnd"/>
-            <w:r>
-              <w:t xml:space="preserve"> incremental </w:t>
+              <w:t xml:space="preserve">12 bit incremental </w:t>
             </w:r>
           </w:p>
           <w:p>
@@ -6634,6 +6587,9 @@
     </w:p>
     <w:p/>
     <w:p>
+      <w:pPr>
+        <w:keepNext/>
+      </w:pPr>
       <w:r>
         <w:rPr>
           <w:noProof/>
@@ -6683,6 +6639,36 @@
             </a:graphic>
           </wp:inline>
         </w:drawing>
+      </w:r>
+    </w:p>
+    <w:p>
+      <w:pPr>
+        <w:pStyle w:val="Caption"/>
+        <w:jc w:val="left"/>
+      </w:pPr>
+      <w:r>
+        <w:t xml:space="preserve">Figure </w:t>
+      </w:r>
+      <w:r>
+        <w:fldChar w:fldCharType="begin"/>
+      </w:r>
+      <w:r>
+        <w:instrText xml:space="preserve"> SEQ Figure \* ARABIC </w:instrText>
+      </w:r>
+      <w:r>
+        <w:fldChar w:fldCharType="separate"/>
+      </w:r>
+      <w:r>
+        <w:rPr>
+          <w:noProof/>
+        </w:rPr>
+        <w:t>3</w:t>
+      </w:r>
+      <w:r>
+        <w:fldChar w:fldCharType="end"/>
+      </w:r>
+      <w:r>
+        <w:t xml:space="preserve"> this is figure 3</w:t>
       </w:r>
     </w:p>
     <w:p>
@@ -6814,17 +6800,8 @@
                 <w:color w:val="FFFFFF"/>
                 <w:highlight w:val="black"/>
               </w:rPr>
-              <w:t xml:space="preserve">Resolution </w:t>
-            </w:r>
-            <w:proofErr w:type="gramStart"/>
-            <w:r>
-              <w:rPr>
-                <w:color w:val="FFFFFF"/>
-                <w:highlight w:val="black"/>
-              </w:rPr>
-              <w:t>/  bit</w:t>
-            </w:r>
-            <w:proofErr w:type="gramEnd"/>
+              <w:t>Resolution /  bit</w:t>
+            </w:r>
           </w:p>
         </w:tc>
         <w:tc>
@@ -6886,17 +6863,8 @@
                 <w:color w:val="FFFFFF"/>
                 <w:highlight w:val="black"/>
               </w:rPr>
-              <w:t>DTest2_</w:t>
-            </w:r>
-            <w:proofErr w:type="gramStart"/>
-            <w:r>
-              <w:rPr>
-                <w:color w:val="FFFFFF"/>
-                <w:highlight w:val="black"/>
-              </w:rPr>
-              <w:t>B  pulses</w:t>
-            </w:r>
-            <w:proofErr w:type="gramEnd"/>
+              <w:t>DTest2_B  pulses</w:t>
+            </w:r>
           </w:p>
         </w:tc>
         <w:tc>
@@ -7146,21 +7114,12 @@
                 <w:highlight w:val="black"/>
               </w:rPr>
             </w:pPr>
-            <w:proofErr w:type="spellStart"/>
             <w:r>
               <w:rPr>
                 <w:color w:val="FFFFFF"/>
                 <w:highlight w:val="black"/>
               </w:rPr>
-              <w:t>Hystereses</w:t>
-            </w:r>
-            <w:proofErr w:type="spellEnd"/>
-            <w:r>
-              <w:rPr>
-                <w:color w:val="FFFFFF"/>
-                <w:highlight w:val="black"/>
-              </w:rPr>
-              <w:t xml:space="preserve"> (LSB)</w:t>
+              <w:t>Hystereses (LSB)</w:t>
             </w:r>
           </w:p>
         </w:tc>
@@ -7627,22 +7586,17 @@
         <w:rPr>
           <w:noProof/>
         </w:rPr>
-        <w:t>7</w:t>
+        <w:t>5</w:t>
       </w:r>
       <w:r>
         <w:fldChar w:fldCharType="end"/>
       </w:r>
       <w:bookmarkEnd w:id="3"/>
       <w:r>
-        <w:t xml:space="preserve">: Setup of </w:t>
-      </w:r>
-      <w:proofErr w:type="spellStart"/>
-      <w:r>
-        <w:t>Hysterese</w:t>
+        <w:t>: Setup of Hysterese</w:t>
       </w:r>
       <w:bookmarkEnd w:id="4"/>
       <w:bookmarkEnd w:id="5"/>
-      <w:proofErr w:type="spellEnd"/>
     </w:p>
     <w:p/>
     <w:p/>
@@ -13651,28 +13605,28 @@
 </file>
 
 <file path=customXml/item1.xml><?xml version="1.0" encoding="utf-8"?>
+<Sources xmlns:b="http://schemas.openxmlformats.org/officeDocument/2006/bibliography" xmlns="http://schemas.openxmlformats.org/officeDocument/2006/bibliography" SelectedStyle="\APASixthEditionOfficeOnline (1).xsl" StyleName="APA" Version="6"/>
+</file>
+
+<file path=customXml/item2.xml><?xml version="1.0" encoding="utf-8"?>
 <ElementMetadata xmlns="http://www.made-in-office.com/empower/docs/element/v1">
   <BinaryId>dfbe75ae-db68-459f-9acc-9a2651dcbb62</BinaryId>
   <ElementId>9b329c89-982a-4e83-badb-ff0ddffb9381</ElementId>
 </ElementMetadata>
 </file>
 
-<file path=customXml/item2.xml><?xml version="1.0" encoding="utf-8"?>
-<Sources xmlns:b="http://schemas.openxmlformats.org/officeDocument/2006/bibliography" xmlns="http://schemas.openxmlformats.org/officeDocument/2006/bibliography" SelectedStyle="\APASixthEditionOfficeOnline (1).xsl" StyleName="APA" Version="6"/>
-</file>
-
 <file path=customXml/itemProps1.xml><?xml version="1.0" encoding="utf-8"?>
-<ds:datastoreItem xmlns:ds="http://schemas.openxmlformats.org/officeDocument/2006/customXml" ds:itemID="{0FF08C31-8723-440F-BAB0-C3A78FB0B425}">
+<ds:datastoreItem xmlns:ds="http://schemas.openxmlformats.org/officeDocument/2006/customXml" ds:itemID="{1A80EA67-42E0-4C50-9559-F08C3118C72A}">
   <ds:schemaRefs>
-    <ds:schemaRef ds:uri="http://www.made-in-office.com/empower/docs/element/v1"/>
+    <ds:schemaRef ds:uri="http://schemas.openxmlformats.org/officeDocument/2006/bibliography"/>
   </ds:schemaRefs>
 </ds:datastoreItem>
 </file>
 
 <file path=customXml/itemProps2.xml><?xml version="1.0" encoding="utf-8"?>
-<ds:datastoreItem xmlns:ds="http://schemas.openxmlformats.org/officeDocument/2006/customXml" ds:itemID="{1A80EA67-42E0-4C50-9559-F08C3118C72A}">
+<ds:datastoreItem xmlns:ds="http://schemas.openxmlformats.org/officeDocument/2006/customXml" ds:itemID="{0FF08C31-8723-440F-BAB0-C3A78FB0B425}">
   <ds:schemaRefs>
-    <ds:schemaRef ds:uri="http://schemas.openxmlformats.org/officeDocument/2006/bibliography"/>
+    <ds:schemaRef ds:uri="http://www.made-in-office.com/empower/docs/element/v1"/>
   </ds:schemaRefs>
 </ds:datastoreItem>
 </file>

</xml_diff>

<commit_message>
Complete migration engine v1
</commit_message>
<xml_diff>
--- a/samples/tables_images_only.docx
+++ b/samples/tables_images_only.docx
@@ -7,6 +7,211 @@
         <w:pStyle w:val="Caption"/>
         <w:keepNext/>
       </w:pPr>
+      <w:r>
+        <w:rPr>
+          <w:noProof/>
+        </w:rPr>
+        <mc:AlternateContent>
+          <mc:Choice Requires="wps">
+            <w:drawing>
+              <wp:anchor distT="0" distB="0" distL="114300" distR="114300" simplePos="0" relativeHeight="251660288" behindDoc="0" locked="0" layoutInCell="1" allowOverlap="1" wp14:anchorId="3792316C" wp14:editId="4B1DA02E">
+                <wp:simplePos x="0" y="0"/>
+                <wp:positionH relativeFrom="column">
+                  <wp:posOffset>3588327</wp:posOffset>
+                </wp:positionH>
+                <wp:positionV relativeFrom="paragraph">
+                  <wp:posOffset>2507673</wp:posOffset>
+                </wp:positionV>
+                <wp:extent cx="1524000" cy="658091"/>
+                <wp:effectExtent l="0" t="0" r="19050" b="27940"/>
+                <wp:wrapNone/>
+                <wp:docPr id="77668532" name="Text Box 8"/>
+                <wp:cNvGraphicFramePr/>
+                <a:graphic xmlns:a="http://schemas.openxmlformats.org/drawingml/2006/main">
+                  <a:graphicData uri="http://schemas.microsoft.com/office/word/2010/wordprocessingShape">
+                    <wps:wsp>
+                      <wps:cNvSpPr txBox="1"/>
+                      <wps:spPr>
+                        <a:xfrm>
+                          <a:off x="0" y="0"/>
+                          <a:ext cx="1524000" cy="658091"/>
+                        </a:xfrm>
+                        <a:prstGeom prst="rect">
+                          <a:avLst/>
+                        </a:prstGeom>
+                        <a:solidFill>
+                          <a:schemeClr val="lt1"/>
+                        </a:solidFill>
+                        <a:ln w="6350">
+                          <a:solidFill>
+                            <a:prstClr val="black"/>
+                          </a:solidFill>
+                        </a:ln>
+                      </wps:spPr>
+                      <wps:txbx>
+                        <w:txbxContent>
+                          <w:p>
+                            <w:pPr>
+                              <w:rPr>
+                                <w:lang w:val="en-IN"/>
+                              </w:rPr>
+                            </w:pPr>
+                            <w:r>
+                              <w:rPr>
+                                <w:lang w:val="en-IN"/>
+                              </w:rPr>
+                              <w:t>Sncjncjscs  c v djnnksndskm</w:t>
+                            </w:r>
+                          </w:p>
+                        </w:txbxContent>
+                      </wps:txbx>
+                      <wps:bodyPr rot="0" spcFirstLastPara="0" vertOverflow="overflow" horzOverflow="overflow" vert="horz" wrap="square" lIns="91440" tIns="45720" rIns="91440" bIns="45720" numCol="1" spcCol="0" rtlCol="0" fromWordArt="0" anchor="t" anchorCtr="0" forceAA="0" compatLnSpc="1">
+                        <a:prstTxWarp prst="textNoShape">
+                          <a:avLst/>
+                        </a:prstTxWarp>
+                        <a:noAutofit/>
+                      </wps:bodyPr>
+                    </wps:wsp>
+                  </a:graphicData>
+                </a:graphic>
+              </wp:anchor>
+            </w:drawing>
+          </mc:Choice>
+          <mc:Fallback>
+            <w:pict>
+              <v:shapetype w14:anchorId="3792316C" id="_x0000_t202" coordsize="21600,21600" o:spt="202" path="m,l,21600r21600,l21600,xe">
+                <v:stroke joinstyle="miter"/>
+                <v:path gradientshapeok="t" o:connecttype="rect"/>
+              </v:shapetype>
+              <v:shape id="Text Box 8" o:spid="_x0000_s1026" type="#_x0000_t202" style="position:absolute;left:0;text-align:left;margin-left:282.55pt;margin-top:197.45pt;width:120pt;height:51.8pt;z-index:251660288;visibility:visible;mso-wrap-style:square;mso-wrap-distance-left:9pt;mso-wrap-distance-top:0;mso-wrap-distance-right:9pt;mso-wrap-distance-bottom:0;mso-position-horizontal:absolute;mso-position-horizontal-relative:text;mso-position-vertical:absolute;mso-position-vertical-relative:text;v-text-anchor:top" o:gfxdata="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" fillcolor="white [3201]" strokeweight=".5pt">
+                <v:textbox>
+                  <w:txbxContent>
+                    <w:p>
+                      <w:pPr>
+                        <w:rPr>
+                          <w:lang w:val="en-IN"/>
+                        </w:rPr>
+                      </w:pPr>
+                      <w:r>
+                        <w:rPr>
+                          <w:lang w:val="en-IN"/>
+                        </w:rPr>
+                        <w:t>Sncjncjscs  c v djnnksndskm</w:t>
+                      </w:r>
+                    </w:p>
+                  </w:txbxContent>
+                </v:textbox>
+              </v:shape>
+            </w:pict>
+          </mc:Fallback>
+        </mc:AlternateContent>
+      </w:r>
+      <w:r>
+        <w:rPr>
+          <w:noProof/>
+        </w:rPr>
+        <mc:AlternateContent>
+          <mc:Choice Requires="wps">
+            <w:drawing>
+              <wp:anchor distT="45720" distB="45720" distL="114300" distR="114300" simplePos="0" relativeHeight="251659264" behindDoc="0" locked="0" layoutInCell="1" allowOverlap="1" wp14:anchorId="25939EE2" wp14:editId="599BDA96">
+                <wp:simplePos x="0" y="0"/>
+                <wp:positionH relativeFrom="column">
+                  <wp:align>center</wp:align>
+                </wp:positionH>
+                <wp:positionV relativeFrom="paragraph">
+                  <wp:posOffset>182880</wp:posOffset>
+                </wp:positionV>
+                <wp:extent cx="2360930" cy="1404620"/>
+                <wp:effectExtent l="0" t="0" r="12700" b="27940"/>
+                <wp:wrapSquare wrapText="bothSides"/>
+                <wp:docPr id="217" name="Text Box 2"/>
+                <wp:cNvGraphicFramePr>
+                  <a:graphicFrameLocks xmlns:a="http://schemas.openxmlformats.org/drawingml/2006/main"/>
+                </wp:cNvGraphicFramePr>
+                <a:graphic xmlns:a="http://schemas.openxmlformats.org/drawingml/2006/main">
+                  <a:graphicData uri="http://schemas.microsoft.com/office/word/2010/wordprocessingShape">
+                    <wps:wsp>
+                      <wps:cNvSpPr txBox="1">
+                        <a:spLocks noChangeArrowheads="1"/>
+                      </wps:cNvSpPr>
+                      <wps:spPr bwMode="auto">
+                        <a:xfrm>
+                          <a:off x="0" y="0"/>
+                          <a:ext cx="2360930" cy="1404620"/>
+                        </a:xfrm>
+                        <a:prstGeom prst="rect">
+                          <a:avLst/>
+                        </a:prstGeom>
+                        <a:solidFill>
+                          <a:srgbClr val="FFFFFF"/>
+                        </a:solidFill>
+                        <a:ln w="9525">
+                          <a:solidFill>
+                            <a:srgbClr val="000000"/>
+                          </a:solidFill>
+                          <a:miter lim="800000"/>
+                          <a:headEnd/>
+                          <a:tailEnd/>
+                        </a:ln>
+                      </wps:spPr>
+                      <wps:txbx>
+                        <w:txbxContent>
+                          <w:p>
+                            <w:pPr>
+                              <w:rPr>
+                                <w:lang w:val="en-IN"/>
+                              </w:rPr>
+                            </w:pPr>
+                            <w:r>
+                              <w:rPr>
+                                <w:lang w:val="en-IN"/>
+                              </w:rPr>
+                              <w:t xml:space="preserve">This is the text box </w:t>
+                            </w:r>
+                          </w:p>
+                        </w:txbxContent>
+                      </wps:txbx>
+                      <wps:bodyPr rot="0" vert="horz" wrap="square" lIns="91440" tIns="45720" rIns="91440" bIns="45720" anchor="t" anchorCtr="0">
+                        <a:spAutoFit/>
+                      </wps:bodyPr>
+                    </wps:wsp>
+                  </a:graphicData>
+                </a:graphic>
+                <wp14:sizeRelH relativeFrom="margin">
+                  <wp14:pctWidth>40000</wp14:pctWidth>
+                </wp14:sizeRelH>
+                <wp14:sizeRelV relativeFrom="margin">
+                  <wp14:pctHeight>20000</wp14:pctHeight>
+                </wp14:sizeRelV>
+              </wp:anchor>
+            </w:drawing>
+          </mc:Choice>
+          <mc:Fallback>
+            <w:pict>
+              <v:shape w14:anchorId="25939EE2" id="Text Box 2" o:spid="_x0000_s1027" type="#_x0000_t202" style="position:absolute;left:0;text-align:left;margin-left:0;margin-top:14.4pt;width:185.9pt;height:110.6pt;z-index:251659264;visibility:visible;mso-wrap-style:square;mso-width-percent:400;mso-height-percent:200;mso-wrap-distance-left:9pt;mso-wrap-distance-top:3.6pt;mso-wrap-distance-right:9pt;mso-wrap-distance-bottom:3.6pt;mso-position-horizontal:center;mso-position-horizontal-relative:text;mso-position-vertical:absolute;mso-position-vertical-relative:text;mso-width-percent:400;mso-height-percent:200;mso-width-relative:margin;mso-height-relative:margin;v-text-anchor:top" o:gfxdata="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">
+                <v:textbox style="mso-fit-shape-to-text:t">
+                  <w:txbxContent>
+                    <w:p>
+                      <w:pPr>
+                        <w:rPr>
+                          <w:lang w:val="en-IN"/>
+                        </w:rPr>
+                      </w:pPr>
+                      <w:r>
+                        <w:rPr>
+                          <w:lang w:val="en-IN"/>
+                        </w:rPr>
+                        <w:t xml:space="preserve">This is the text box </w:t>
+                      </w:r>
+                    </w:p>
+                  </w:txbxContent>
+                </v:textbox>
+                <w10:wrap type="square"/>
+              </v:shape>
+            </w:pict>
+          </mc:Fallback>
+        </mc:AlternateContent>
+      </w:r>
       <w:r>
         <w:t xml:space="preserve">Table </w:t>
       </w:r>
@@ -2965,6 +3170,7 @@
               <w:rPr>
                 <w:lang w:val="en-US"/>
               </w:rPr>
+              <w:lastRenderedPageBreak/>
               <w:t>6</w:t>
             </w:r>
           </w:p>
@@ -3491,6 +3697,7 @@
         <w:keepNext/>
       </w:pPr>
       <w:r>
+        <w:lastRenderedPageBreak/>
         <w:t xml:space="preserve">Table </w:t>
       </w:r>
       <w:r>
@@ -5493,6 +5700,7 @@
                 <w:sz w:val="18"/>
                 <w:lang w:val="en-US"/>
               </w:rPr>
+              <w:lastRenderedPageBreak/>
               <w:t>0</w:t>
             </w:r>
           </w:p>
@@ -5934,7 +6142,6 @@
                 <w:sz w:val="18"/>
                 <w:lang w:val="en-US"/>
               </w:rPr>
-              <w:lastRenderedPageBreak/>
               <w:t>All other combinations</w:t>
             </w:r>
           </w:p>
@@ -7411,6 +7618,7 @@
               <w:rPr>
                 <w:sz w:val="20"/>
               </w:rPr>
+              <w:lastRenderedPageBreak/>
               <w:t>6</w:t>
             </w:r>
           </w:p>
@@ -7605,7 +7813,6 @@
         <w:rPr>
           <w:noProof/>
         </w:rPr>
-        <w:lastRenderedPageBreak/>
         <w:drawing>
           <wp:inline distT="0" distB="0" distL="0" distR="0" wp14:anchorId="04643F60" wp14:editId="3264B4DD">
             <wp:extent cx="3276600" cy="2228850"/>
@@ -7654,6 +7861,112 @@
       </w:r>
     </w:p>
     <w:p>
+      <w:r>
+        <w:rPr>
+          <w:noProof/>
+        </w:rPr>
+        <mc:AlternateContent>
+          <mc:Choice Requires="wps">
+            <w:drawing>
+              <wp:anchor distT="45720" distB="45720" distL="114300" distR="114300" simplePos="0" relativeHeight="251662336" behindDoc="0" locked="0" layoutInCell="1" allowOverlap="1" wp14:anchorId="602A9F72" wp14:editId="5E33BD7E">
+                <wp:simplePos x="0" y="0"/>
+                <wp:positionH relativeFrom="column">
+                  <wp:align>center</wp:align>
+                </wp:positionH>
+                <wp:positionV relativeFrom="paragraph">
+                  <wp:posOffset>182880</wp:posOffset>
+                </wp:positionV>
+                <wp:extent cx="2360930" cy="1404620"/>
+                <wp:effectExtent l="0" t="0" r="22860" b="11430"/>
+                <wp:wrapSquare wrapText="bothSides"/>
+                <wp:docPr id="1847676461" name="Text Box 2"/>
+                <wp:cNvGraphicFramePr>
+                  <a:graphicFrameLocks xmlns:a="http://schemas.openxmlformats.org/drawingml/2006/main"/>
+                </wp:cNvGraphicFramePr>
+                <a:graphic xmlns:a="http://schemas.openxmlformats.org/drawingml/2006/main">
+                  <a:graphicData uri="http://schemas.microsoft.com/office/word/2010/wordprocessingShape">
+                    <wps:wsp>
+                      <wps:cNvSpPr txBox="1">
+                        <a:spLocks noChangeArrowheads="1"/>
+                      </wps:cNvSpPr>
+                      <wps:spPr bwMode="auto">
+                        <a:xfrm>
+                          <a:off x="0" y="0"/>
+                          <a:ext cx="2360930" cy="1404620"/>
+                        </a:xfrm>
+                        <a:prstGeom prst="rect">
+                          <a:avLst/>
+                        </a:prstGeom>
+                        <a:solidFill>
+                          <a:srgbClr val="FFFFFF"/>
+                        </a:solidFill>
+                        <a:ln w="9525">
+                          <a:solidFill>
+                            <a:srgbClr val="000000"/>
+                          </a:solidFill>
+                          <a:miter lim="800000"/>
+                          <a:headEnd/>
+                          <a:tailEnd/>
+                        </a:ln>
+                      </wps:spPr>
+                      <wps:txbx>
+                        <w:txbxContent>
+                          <w:p>
+                            <w:pPr>
+                              <w:rPr>
+                                <w:lang w:val="en-IN"/>
+                              </w:rPr>
+                            </w:pPr>
+                            <w:r>
+                              <w:rPr>
+                                <w:lang w:val="en-IN"/>
+                              </w:rPr>
+                              <w:t>jsncjcxjsncjsnknvcncslnlsnclnc</w:t>
+                            </w:r>
+                          </w:p>
+                        </w:txbxContent>
+                      </wps:txbx>
+                      <wps:bodyPr rot="0" vert="horz" wrap="square" lIns="91440" tIns="45720" rIns="91440" bIns="45720" anchor="t" anchorCtr="0">
+                        <a:spAutoFit/>
+                      </wps:bodyPr>
+                    </wps:wsp>
+                  </a:graphicData>
+                </a:graphic>
+                <wp14:sizeRelH relativeFrom="margin">
+                  <wp14:pctWidth>40000</wp14:pctWidth>
+                </wp14:sizeRelH>
+                <wp14:sizeRelV relativeFrom="margin">
+                  <wp14:pctHeight>20000</wp14:pctHeight>
+                </wp14:sizeRelV>
+              </wp:anchor>
+            </w:drawing>
+          </mc:Choice>
+          <mc:Fallback>
+            <w:pict>
+              <v:shape w14:anchorId="602A9F72" id="_x0000_s1028" type="#_x0000_t202" style="position:absolute;margin-left:0;margin-top:14.4pt;width:185.9pt;height:110.6pt;z-index:251662336;visibility:visible;mso-wrap-style:square;mso-width-percent:400;mso-height-percent:200;mso-wrap-distance-left:9pt;mso-wrap-distance-top:3.6pt;mso-wrap-distance-right:9pt;mso-wrap-distance-bottom:3.6pt;mso-position-horizontal:center;mso-position-horizontal-relative:text;mso-position-vertical:absolute;mso-position-vertical-relative:text;mso-width-percent:400;mso-height-percent:200;mso-width-relative:margin;mso-height-relative:margin;v-text-anchor:top" o:gfxdata="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">
+                <v:textbox style="mso-fit-shape-to-text:t">
+                  <w:txbxContent>
+                    <w:p>
+                      <w:pPr>
+                        <w:rPr>
+                          <w:lang w:val="en-IN"/>
+                        </w:rPr>
+                      </w:pPr>
+                      <w:r>
+                        <w:rPr>
+                          <w:lang w:val="en-IN"/>
+                        </w:rPr>
+                        <w:t>jsncjcxjsncjsnknvcncslnlsnclnc</w:t>
+                      </w:r>
+                    </w:p>
+                  </w:txbxContent>
+                </v:textbox>
+                <w10:wrap type="square"/>
+              </v:shape>
+            </w:pict>
+          </mc:Fallback>
+        </mc:AlternateContent>
+      </w:r>
       <w:r>
         <w:rPr>
           <w:noProof/>
@@ -13605,28 +13918,28 @@
 </file>
 
 <file path=customXml/item1.xml><?xml version="1.0" encoding="utf-8"?>
-<Sources xmlns:b="http://schemas.openxmlformats.org/officeDocument/2006/bibliography" xmlns="http://schemas.openxmlformats.org/officeDocument/2006/bibliography" SelectedStyle="\APASixthEditionOfficeOnline (1).xsl" StyleName="APA" Version="6"/>
-</file>
-
-<file path=customXml/item2.xml><?xml version="1.0" encoding="utf-8"?>
 <ElementMetadata xmlns="http://www.made-in-office.com/empower/docs/element/v1">
   <BinaryId>dfbe75ae-db68-459f-9acc-9a2651dcbb62</BinaryId>
   <ElementId>9b329c89-982a-4e83-badb-ff0ddffb9381</ElementId>
 </ElementMetadata>
 </file>
 
+<file path=customXml/item2.xml><?xml version="1.0" encoding="utf-8"?>
+<Sources xmlns:b="http://schemas.openxmlformats.org/officeDocument/2006/bibliography" xmlns="http://schemas.openxmlformats.org/officeDocument/2006/bibliography" SelectedStyle="\APASixthEditionOfficeOnline (1).xsl" StyleName="APA" Version="6"/>
+</file>
+
 <file path=customXml/itemProps1.xml><?xml version="1.0" encoding="utf-8"?>
-<ds:datastoreItem xmlns:ds="http://schemas.openxmlformats.org/officeDocument/2006/customXml" ds:itemID="{1A80EA67-42E0-4C50-9559-F08C3118C72A}">
+<ds:datastoreItem xmlns:ds="http://schemas.openxmlformats.org/officeDocument/2006/customXml" ds:itemID="{0FF08C31-8723-440F-BAB0-C3A78FB0B425}">
   <ds:schemaRefs>
-    <ds:schemaRef ds:uri="http://schemas.openxmlformats.org/officeDocument/2006/bibliography"/>
+    <ds:schemaRef ds:uri="http://www.made-in-office.com/empower/docs/element/v1"/>
   </ds:schemaRefs>
 </ds:datastoreItem>
 </file>
 
 <file path=customXml/itemProps2.xml><?xml version="1.0" encoding="utf-8"?>
-<ds:datastoreItem xmlns:ds="http://schemas.openxmlformats.org/officeDocument/2006/customXml" ds:itemID="{0FF08C31-8723-440F-BAB0-C3A78FB0B425}">
+<ds:datastoreItem xmlns:ds="http://schemas.openxmlformats.org/officeDocument/2006/customXml" ds:itemID="{1A80EA67-42E0-4C50-9559-F08C3118C72A}">
   <ds:schemaRefs>
-    <ds:schemaRef ds:uri="http://www.made-in-office.com/empower/docs/element/v1"/>
+    <ds:schemaRef ds:uri="http://schemas.openxmlformats.org/officeDocument/2006/bibliography"/>
   </ds:schemaRefs>
 </ds:datastoreItem>
 </file>

</xml_diff>